<commit_message>
fix: align generated docx with template styles and structure
Co-authored-by: eastaizah <258072108+eastaizah@users.noreply.github.com>
</commit_message>
<xml_diff>
--- a/ConversionMDPI/LiSAT_futureinternet_test.docx
+++ b/ConversionMDPI/LiSAT_futureinternet_test.docx
@@ -2617,7 +2617,7 @@
           </w:tcPr>
           <w:p>
             <w:pPr>
-              <w:pStyle w:val="MDPI41tablecaption"/>
+              <w:pStyle w:val="MDPI42tablebody"/>
               <w:rPr>
                 <w:sz w:val="20"/>
               </w:rPr>
@@ -3022,7 +3022,7 @@
           </w:tcPr>
           <w:p>
             <w:pPr>
-              <w:pStyle w:val="MDPI41tablecaption"/>
+              <w:pStyle w:val="MDPI42tablebody"/>
               <w:rPr>
                 <w:sz w:val="20"/>
               </w:rPr>
@@ -3493,7 +3493,7 @@
           </w:tcPr>
           <w:p>
             <w:pPr>
-              <w:pStyle w:val="MDPI41tablecaption"/>
+              <w:pStyle w:val="MDPI42tablebody"/>
               <w:rPr>
                 <w:rFonts w:ascii="Cambria Math" w:hAnsi="Cambria Math"/>
                 <w:i/>
@@ -3831,7 +3831,7 @@
           </w:tcPr>
           <w:p>
             <w:pPr>
-              <w:pStyle w:val="MDPI41tablecaption"/>
+              <w:pStyle w:val="MDPI42tablebody"/>
               <w:rPr>
                 <w:rFonts w:ascii="Cambria Math" w:hAnsi="Cambria Math"/>
                 <w:i/>
@@ -4181,7 +4181,7 @@
           </w:tcPr>
           <w:p>
             <w:pPr>
-              <w:pStyle w:val="MDPI41tablecaption"/>
+              <w:pStyle w:val="MDPI42tablebody"/>
               <w:rPr>
                 <w:sz w:val="20"/>
                 <w:szCs w:val="20"/>
@@ -4690,7 +4690,7 @@
           </w:tcPr>
           <w:p>
             <w:pPr>
-              <w:pStyle w:val="MDPI41tablecaption"/>
+              <w:pStyle w:val="MDPI42tablebody"/>
               <w:rPr>
                 <w:sz w:val="20"/>
                 <w:szCs w:val="20"/>
@@ -5230,7 +5230,7 @@
           </w:tcPr>
           <w:p>
             <w:pPr>
-              <w:pStyle w:val="MDPI41tablecaption"/>
+              <w:pStyle w:val="MDPI42tablebody"/>
               <w:rPr>
                 <w:rFonts w:asciiTheme="minorHAnsi" w:hAnsiTheme="minorHAnsi" w:cs="Calibri"/>
               </w:rPr>
@@ -5255,7 +5255,7 @@
           </w:tcPr>
           <w:p>
             <w:pPr>
-              <w:pStyle w:val="MDPI41tablecaption"/>
+              <w:pStyle w:val="MDPI42tablebody"/>
               <w:cnfStyle w:val="100000000000" w:firstRow="1" w:lastRow="0" w:firstColumn="0" w:lastColumn="0" w:oddVBand="0" w:evenVBand="0" w:oddHBand="0" w:evenHBand="0" w:firstRowFirstColumn="0" w:firstRowLastColumn="0" w:lastRowFirstColumn="0" w:lastRowLastColumn="0"/>
               <w:rPr>
                 <w:rFonts w:asciiTheme="minorHAnsi" w:hAnsiTheme="minorHAnsi" w:cs="Calibri"/>
@@ -5295,7 +5295,7 @@
           </w:tcPr>
           <w:p>
             <w:pPr>
-              <w:pStyle w:val="MDPI41tablecaption"/>
+              <w:pStyle w:val="MDPI42tablebody"/>
               <w:cnfStyle w:val="100000000000" w:firstRow="1" w:lastRow="0" w:firstColumn="0" w:lastColumn="0" w:oddVBand="0" w:evenVBand="0" w:oddHBand="0" w:evenHBand="0" w:firstRowFirstColumn="0" w:firstRowLastColumn="0" w:lastRowFirstColumn="0" w:lastRowLastColumn="0"/>
               <w:rPr>
                 <w:rFonts w:asciiTheme="minorHAnsi" w:hAnsiTheme="minorHAnsi" w:cs="Calibri"/>
@@ -5327,7 +5327,7 @@
           </w:tcPr>
           <w:p>
             <w:pPr>
-              <w:pStyle w:val="MDPI41tablecaption"/>
+              <w:pStyle w:val="MDPI42tablebody"/>
               <w:cnfStyle w:val="100000000000" w:firstRow="1" w:lastRow="0" w:firstColumn="0" w:lastColumn="0" w:oddVBand="0" w:evenVBand="0" w:oddHBand="0" w:evenHBand="0" w:firstRowFirstColumn="0" w:firstRowLastColumn="0" w:lastRowFirstColumn="0" w:lastRowLastColumn="0"/>
               <w:rPr>
                 <w:rFonts w:asciiTheme="minorHAnsi" w:hAnsiTheme="minorHAnsi" w:cs="Calibri"/>
@@ -5359,7 +5359,7 @@
           </w:tcPr>
           <w:p>
             <w:pPr>
-              <w:pStyle w:val="MDPI41tablecaption"/>
+              <w:pStyle w:val="MDPI42tablebody"/>
               <w:cnfStyle w:val="100000000000" w:firstRow="1" w:lastRow="0" w:firstColumn="0" w:lastColumn="0" w:oddVBand="0" w:evenVBand="0" w:oddHBand="0" w:evenHBand="0" w:firstRowFirstColumn="0" w:firstRowLastColumn="0" w:lastRowFirstColumn="0" w:lastRowLastColumn="0"/>
               <w:rPr>
                 <w:rFonts w:asciiTheme="minorHAnsi" w:hAnsiTheme="minorHAnsi" w:cs="Calibri"/>
@@ -5383,7 +5383,7 @@
           </w:tcPr>
           <w:p>
             <w:pPr>
-              <w:pStyle w:val="MDPI41tablecaption"/>
+              <w:pStyle w:val="MDPI42tablebody"/>
               <w:cnfStyle w:val="100000000000" w:firstRow="1" w:lastRow="0" w:firstColumn="0" w:lastColumn="0" w:oddVBand="0" w:evenVBand="0" w:oddHBand="0" w:evenHBand="0" w:firstRowFirstColumn="0" w:firstRowLastColumn="0" w:lastRowFirstColumn="0" w:lastRowLastColumn="0"/>
               <w:rPr>
                 <w:rFonts w:asciiTheme="minorHAnsi" w:hAnsiTheme="minorHAnsi" w:cs="Calibri"/>
@@ -6892,7 +6892,7 @@
           </w:tcPr>
           <w:p>
             <w:pPr>
-              <w:pStyle w:val="MDPI41tablecaption"/>
+              <w:pStyle w:val="MDPI42tablebody"/>
               <w:rPr>
                 <w:sz w:val="20"/>
                 <w:szCs w:val="20"/>
@@ -7169,7 +7169,7 @@
           </w:tcPr>
           <w:p>
             <w:pPr>
-              <w:pStyle w:val="MDPI41tablecaption"/>
+              <w:pStyle w:val="MDPI42tablebody"/>
               <w:rPr>
                 <w:sz w:val="20"/>
                 <w:szCs w:val="20"/>
@@ -7260,7 +7260,7 @@
           </w:tcPr>
           <w:p>
             <w:pPr>
-              <w:pStyle w:val="MDPI41tablecaption"/>
+              <w:pStyle w:val="MDPI42tablebody"/>
               <w:rPr>
                 <w:sz w:val="20"/>
                 <w:szCs w:val="20"/>
@@ -7557,7 +7557,7 @@
           </w:tcPr>
           <w:p>
             <w:pPr>
-              <w:pStyle w:val="MDPI41tablecaption"/>
+              <w:pStyle w:val="MDPI42tablebody"/>
               <w:rPr>
                 <w:sz w:val="20"/>
                 <w:szCs w:val="20"/>
@@ -7941,7 +7941,7 @@
           </w:tcPr>
           <w:p>
             <w:pPr>
-              <w:pStyle w:val="MDPI41tablecaption"/>
+              <w:pStyle w:val="MDPI42tablebody"/>
               <w:rPr>
                 <w:rFonts w:cs="Calibri"/>
                 <w:b/>
@@ -7966,7 +7966,7 @@
           </w:tcPr>
           <w:p>
             <w:pPr>
-              <w:pStyle w:val="MDPI41tablecaption"/>
+              <w:pStyle w:val="MDPI42tablebody"/>
               <w:rPr>
                 <w:rFonts w:cs="Calibri"/>
                 <w:b/>
@@ -8601,7 +8601,7 @@
           </w:tcPr>
           <w:p>
             <w:pPr>
-              <w:pStyle w:val="MDPI41tablecaption"/>
+              <w:pStyle w:val="MDPI42tablebody"/>
               <w:rPr>
                 <w:sz w:val="20"/>
                 <w:szCs w:val="20"/>
@@ -8965,7 +8965,7 @@
           </w:tcPr>
           <w:p>
             <w:pPr>
-              <w:pStyle w:val="MDPI41tablecaption"/>
+              <w:pStyle w:val="MDPI42tablebody"/>
               <w:rPr>
                 <w:sz w:val="20"/>
                 <w:szCs w:val="20"/>
@@ -9225,7 +9225,7 @@
           </w:tcPr>
           <w:p>
             <w:pPr>
-              <w:pStyle w:val="MDPI41tablecaption"/>
+              <w:pStyle w:val="MDPI42tablebody"/>
               <w:rPr>
                 <w:sz w:val="20"/>
                 <w:szCs w:val="20"/>
@@ -9455,7 +9455,7 @@
           </w:tcPr>
           <w:p>
             <w:pPr>
-              <w:pStyle w:val="MDPI41tablecaption"/>
+              <w:pStyle w:val="MDPI42tablebody"/>
               <w:rPr>
                 <w:sz w:val="20"/>
                 <w:szCs w:val="20"/>
@@ -9807,7 +9807,7 @@
           </w:tcPr>
           <w:p>
             <w:pPr>
-              <w:pStyle w:val="MDPI41tablecaption"/>
+              <w:pStyle w:val="MDPI42tablebody"/>
               <w:rPr>
                 <w:sz w:val="20"/>
                 <w:szCs w:val="20"/>
@@ -10029,7 +10029,7 @@
           </w:tcPr>
           <w:p>
             <w:pPr>
-              <w:pStyle w:val="MDPI41tablecaption"/>
+              <w:pStyle w:val="MDPI42tablebody"/>
               <w:rPr>
                 <w:sz w:val="20"/>
                 <w:szCs w:val="20"/>
@@ -10569,7 +10569,7 @@
           </w:tcPr>
           <w:p>
             <w:pPr>
-              <w:pStyle w:val="MDPI41tablecaption"/>
+              <w:pStyle w:val="MDPI42tablebody"/>
               <w:rPr>
                 <w:sz w:val="20"/>
                 <w:szCs w:val="20"/>
@@ -10994,7 +10994,7 @@
           </w:tcPr>
           <w:p>
             <w:pPr>
-              <w:pStyle w:val="MDPI41tablecaption"/>
+              <w:pStyle w:val="MDPI42tablebody"/>
               <w:rPr>
                 <w:sz w:val="20"/>
                 <w:szCs w:val="20"/>
@@ -12102,7 +12102,7 @@
           </w:tcPr>
           <w:p>
             <w:pPr>
-              <w:pStyle w:val="MDPI41tablecaption"/>
+              <w:pStyle w:val="MDPI42tablebody"/>
               <w:rPr>
                 <w:sz w:val="20"/>
                 <w:szCs w:val="20"/>
@@ -12603,7 +12603,7 @@
           </w:tcPr>
           <w:p>
             <w:pPr>
-              <w:pStyle w:val="MDPI41tablecaption"/>
+              <w:pStyle w:val="MDPI42tablebody"/>
               <w:rPr>
                 <w:sz w:val="20"/>
                 <w:szCs w:val="20"/>
@@ -13438,7 +13438,7 @@
           </w:tcPr>
           <w:p>
             <w:pPr>
-              <w:pStyle w:val="MDPI41tablecaption"/>
+              <w:pStyle w:val="MDPI42tablebody"/>
               <w:rPr>
                 <w:sz w:val="20"/>
                 <w:szCs w:val="20"/>
@@ -13691,7 +13691,7 @@
           </w:tcPr>
           <w:p>
             <w:pPr>
-              <w:pStyle w:val="MDPI41tablecaption"/>
+              <w:pStyle w:val="MDPI42tablebody"/>
               <w:rPr>
                 <w:sz w:val="20"/>
                 <w:szCs w:val="20"/>
@@ -13766,7 +13766,7 @@
           </w:tcPr>
           <w:p>
             <w:pPr>
-              <w:pStyle w:val="MDPI41tablecaption"/>
+              <w:pStyle w:val="MDPI42tablebody"/>
               <w:rPr>
                 <w:sz w:val="20"/>
                 <w:szCs w:val="20"/>
@@ -14118,7 +14118,7 @@
           </w:tcPr>
           <w:p>
             <w:pPr>
-              <w:pStyle w:val="MDPI41tablecaption"/>
+              <w:pStyle w:val="MDPI42tablebody"/>
               <w:rPr>
                 <w:sz w:val="20"/>
                 <w:szCs w:val="20"/>
@@ -14172,7 +14172,7 @@
           </w:tcPr>
           <w:p>
             <w:pPr>
-              <w:pStyle w:val="MDPI41tablecaption"/>
+              <w:pStyle w:val="MDPI42tablebody"/>
               <w:rPr>
                 <w:sz w:val="20"/>
                 <w:szCs w:val="20"/>
@@ -14376,7 +14376,7 @@
           </w:tcPr>
           <w:p>
             <w:pPr>
-              <w:pStyle w:val="MDPI41tablecaption"/>
+              <w:pStyle w:val="MDPI42tablebody"/>
               <w:rPr>
                 <w:sz w:val="20"/>
                 <w:szCs w:val="20"/>
@@ -15487,7 +15487,7 @@
           </w:tcPr>
           <w:p>
             <w:pPr>
-              <w:pStyle w:val="MDPI41tablecaption"/>
+              <w:pStyle w:val="MDPI42tablebody"/>
               <w:rPr>
                 <w:sz w:val="20"/>
                 <w:szCs w:val="20"/>
@@ -15705,7 +15705,7 @@
           </w:tcPr>
           <w:p>
             <w:pPr>
-              <w:pStyle w:val="MDPI41tablecaption"/>
+              <w:pStyle w:val="MDPI42tablebody"/>
               <w:rPr>
                 <w:sz w:val="20"/>
                 <w:szCs w:val="20"/>
@@ -16914,7 +16914,7 @@
           </w:tcPr>
           <w:p>
             <w:pPr>
-              <w:pStyle w:val="MDPI41tablecaption"/>
+              <w:pStyle w:val="MDPI42tablebody"/>
               <w:rPr>
                 <w:sz w:val="20"/>
                 <w:szCs w:val="20"/>
@@ -17075,7 +17075,7 @@
           </w:tcPr>
           <w:p>
             <w:pPr>
-              <w:pStyle w:val="MDPI41tablecaption"/>
+              <w:pStyle w:val="MDPI42tablebody"/>
               <w:rPr>
                 <w:sz w:val="20"/>
                 <w:szCs w:val="20"/>
@@ -17563,7 +17563,7 @@
           </w:tcPr>
           <w:p>
             <w:pPr>
-              <w:pStyle w:val="MDPI41tablecaption"/>
+              <w:pStyle w:val="MDPI42tablebody"/>
               <w:rPr>
                 <w:rFonts w:ascii="Calibri" w:hAnsi="Calibri" w:cs="Calibri"/>
                 <w:sz w:val="20"/>
@@ -17589,7 +17589,7 @@
           </w:tcPr>
           <w:p>
             <w:pPr>
-              <w:pStyle w:val="MDPI41tablecaption"/>
+              <w:pStyle w:val="MDPI42tablebody"/>
               <w:rPr>
                 <w:rFonts w:ascii="Calibri" w:hAnsi="Calibri" w:cs="Calibri"/>
                 <w:sz w:val="20"/>
@@ -17615,7 +17615,7 @@
           </w:tcPr>
           <w:p>
             <w:pPr>
-              <w:pStyle w:val="MDPI41tablecaption"/>
+              <w:pStyle w:val="MDPI42tablebody"/>
               <w:rPr>
                 <w:rFonts w:ascii="Calibri" w:hAnsi="Calibri" w:cs="Calibri"/>
                 <w:sz w:val="20"/>
@@ -17641,7 +17641,7 @@
           </w:tcPr>
           <w:p>
             <w:pPr>
-              <w:pStyle w:val="MDPI41tablecaption"/>
+              <w:pStyle w:val="MDPI42tablebody"/>
               <w:rPr>
                 <w:rFonts w:ascii="Calibri" w:hAnsi="Calibri" w:cs="Calibri"/>
                 <w:sz w:val="20"/>
@@ -17667,7 +17667,7 @@
           </w:tcPr>
           <w:p>
             <w:pPr>
-              <w:pStyle w:val="MDPI41tablecaption"/>
+              <w:pStyle w:val="MDPI42tablebody"/>
               <w:rPr>
                 <w:rFonts w:ascii="Calibri" w:hAnsi="Calibri" w:cs="Calibri"/>
                 <w:sz w:val="20"/>
@@ -21628,7 +21628,7 @@
           </w:tcPr>
           <w:p>
             <w:pPr>
-              <w:pStyle w:val="MDPI41tablecaption"/>
+              <w:pStyle w:val="MDPI42tablebody"/>
               <w:rPr>
                 <w:sz w:val="20"/>
                 <w:szCs w:val="20"/>
@@ -21977,7 +21977,7 @@
           </w:tcPr>
           <w:p>
             <w:pPr>
-              <w:pStyle w:val="MDPI41tablecaption"/>
+              <w:pStyle w:val="MDPI42tablebody"/>
               <w:rPr>
                 <w:sz w:val="20"/>
                 <w:szCs w:val="20"/>
@@ -22388,7 +22388,7 @@
           </w:tcPr>
           <w:p>
             <w:pPr>
-              <w:pStyle w:val="MDPI41tablecaption"/>
+              <w:pStyle w:val="MDPI42tablebody"/>
               <w:rPr>
                 <w:rFonts w:ascii="Calibri" w:hAnsi="Calibri" w:cs="Calibri"/>
                 <w:sz w:val="20"/>
@@ -22414,7 +22414,7 @@
           </w:tcPr>
           <w:p>
             <w:pPr>
-              <w:pStyle w:val="MDPI41tablecaption"/>
+              <w:pStyle w:val="MDPI42tablebody"/>
               <w:rPr>
                 <w:rFonts w:ascii="Calibri" w:hAnsi="Calibri" w:cs="Calibri"/>
                 <w:sz w:val="20"/>
@@ -22440,7 +22440,7 @@
           </w:tcPr>
           <w:p>
             <w:pPr>
-              <w:pStyle w:val="MDPI41tablecaption"/>
+              <w:pStyle w:val="MDPI42tablebody"/>
               <w:rPr>
                 <w:rFonts w:ascii="Calibri" w:hAnsi="Calibri" w:cs="Calibri"/>
                 <w:sz w:val="20"/>
@@ -22495,7 +22495,7 @@
           </w:tcPr>
           <w:p>
             <w:pPr>
-              <w:pStyle w:val="MDPI41tablecaption"/>
+              <w:pStyle w:val="MDPI42tablebody"/>
               <w:rPr>
                 <w:rFonts w:ascii="Calibri" w:hAnsi="Calibri" w:cs="Calibri"/>
                 <w:sz w:val="20"/>
@@ -22554,7 +22554,7 @@
           </w:tcPr>
           <w:p>
             <w:pPr>
-              <w:pStyle w:val="MDPI41tablecaption"/>
+              <w:pStyle w:val="MDPI42tablebody"/>
               <w:rPr>
                 <w:rFonts w:ascii="Calibri" w:hAnsi="Calibri" w:cs="Calibri"/>
                 <w:sz w:val="20"/>
@@ -22632,7 +22632,7 @@
           </w:tcPr>
           <w:p>
             <w:pPr>
-              <w:pStyle w:val="MDPI41tablecaption"/>
+              <w:pStyle w:val="MDPI42tablebody"/>
               <w:rPr>
                 <w:rFonts w:ascii="Calibri" w:hAnsi="Calibri" w:cs="Calibri"/>
                 <w:sz w:val="20"/>
@@ -24631,7 +24631,7 @@
           </w:tcPr>
           <w:p>
             <w:pPr>
-              <w:pStyle w:val="MDPI41tablecaption"/>
+              <w:pStyle w:val="MDPI42tablebody"/>
               <w:rPr>
                 <w:rFonts w:ascii="Calibri" w:hAnsi="Calibri" w:cs="Calibri"/>
                 <w:sz w:val="18"/>
@@ -24657,7 +24657,7 @@
           </w:tcPr>
           <w:p>
             <w:pPr>
-              <w:pStyle w:val="MDPI41tablecaption"/>
+              <w:pStyle w:val="MDPI42tablebody"/>
               <w:rPr>
                 <w:rFonts w:ascii="Calibri" w:hAnsi="Calibri" w:cs="Calibri"/>
                 <w:sz w:val="18"/>
@@ -24683,7 +24683,7 @@
           </w:tcPr>
           <w:p>
             <w:pPr>
-              <w:pStyle w:val="MDPI41tablecaption"/>
+              <w:pStyle w:val="MDPI42tablebody"/>
               <w:rPr>
                 <w:rFonts w:ascii="Calibri" w:hAnsi="Calibri" w:cs="Calibri"/>
                 <w:sz w:val="18"/>
@@ -24738,7 +24738,7 @@
           </w:tcPr>
           <w:p>
             <w:pPr>
-              <w:pStyle w:val="MDPI41tablecaption"/>
+              <w:pStyle w:val="MDPI42tablebody"/>
               <w:rPr>
                 <w:rFonts w:ascii="Calibri" w:hAnsi="Calibri" w:cs="Calibri"/>
                 <w:sz w:val="18"/>
@@ -24797,7 +24797,7 @@
           </w:tcPr>
           <w:p>
             <w:pPr>
-              <w:pStyle w:val="MDPI41tablecaption"/>
+              <w:pStyle w:val="MDPI42tablebody"/>
               <w:rPr>
                 <w:rFonts w:ascii="Calibri" w:hAnsi="Calibri" w:cs="Calibri"/>
                 <w:sz w:val="18"/>

</xml_diff>